<commit_message>
Cập nhật câu hỏi trả lời ngắn bài 1 Vật lí 10 (không dùng tính toán)
</commit_message>
<xml_diff>
--- a/Lop10/Bai1/Phieu_BaiTap.docx
+++ b/Lop10/Bai1/Phieu_BaiTap.docx
@@ -1214,13 +1214,13 @@
           <w:rFonts w:ascii="Times New Roman" w:hAnsi="Times New Roman"/>
           <w:b/>
         </w:rPr>
-        <w:t>Câu 1 [THTN]:</w:t>
+        <w:t>Câu 1 [NTVL]:</w:t>
       </w:r>
       <w:r>
         <w:rPr>
           <w:rFonts w:ascii="Times New Roman" w:hAnsi="Times New Roman"/>
         </w:rPr>
-        <w:t xml:space="preserve"> Một pin năng lượng mặt trời có hiệu suất chuyển đổi quang năng thành điện năng là 20%. Khi pin nhận được năng lượng ánh sáng mặt trời là 500 J trong 1 giây, tính lượng điện năng thu được (theo đơn vị Joules - J).  </w:t>
+        <w:t xml:space="preserve"> Quy trình nghiên cứu Vật lí theo phương pháp thực nghiệm gồm có bao nhiêu bước cơ bản?  </w:t>
       </w:r>
     </w:p>
     <w:p>
@@ -1256,7 +1256,7 @@
         <w:rPr>
           <w:rFonts w:ascii="Times New Roman" w:hAnsi="Times New Roman"/>
         </w:rPr>
-        <w:t xml:space="preserve"> Một kính thiên văn quan sát một ngôi sao cách Trái Đất 4 năm ánh sáng. Biết tốc độ ánh sáng truyền trong chân không là 300.000 km/s. Tính khoảng thời gian (theo đơn vị năm) để ánh sáng phát ra từ ngôi sao đó truyền tới mắt người quan sát trên Trái Đất.  </w:t>
+        <w:t xml:space="preserve"> Phát minh ra máy hơi nước của James Watt (khi nghiên cứu về Nhiệt học) là động lực khởi đầu cho cuộc cách mạng công nghiệp lần thứ mấy của nhân loại?  </w:t>
       </w:r>
     </w:p>
     <w:p>
@@ -1286,13 +1286,13 @@
           <w:rFonts w:ascii="Times New Roman" w:hAnsi="Times New Roman"/>
           <w:b/>
         </w:rPr>
-        <w:t>Câu 3 [VDKT]:</w:t>
+        <w:t>Câu 3 [NTVL]:</w:t>
       </w:r>
       <w:r>
         <w:rPr>
           <w:rFonts w:ascii="Times New Roman" w:hAnsi="Times New Roman"/>
         </w:rPr>
-        <w:t xml:space="preserve"> Trong y học, một liều chiếu xạ tia X truyền cho vùng cơ thể bị bệnh một năng lượng 0,4 J. Nếu khối lượng vùng cơ thể nhận liều chiếu xạ là 2 kg, tính liều hấp thụ năng lượng trung bình trên mỗi kilôgam cơ thể (theo đơn vị J/kg).  </w:t>
+        <w:t xml:space="preserve"> Có bao nhiêu phương pháp nghiên cứu cơ bản được sử dụng chủ yếu trong Vật lí học (gồm phương pháp thực nghiệm và phương pháp lý thuyết)?  </w:t>
       </w:r>
     </w:p>
     <w:p>
@@ -1328,7 +1328,75 @@
         <w:rPr>
           <w:rFonts w:ascii="Times New Roman" w:hAnsi="Times New Roman"/>
         </w:rPr>
-        <w:t xml:space="preserve"> Một trạm phát sóng radio phát ra sóng vô tuyến có bước sóng λ = 100 m. Biết tốc độ truyền sóng điện từ trong không khí là c = 3 · 10⁸ m/s. Tính tần số của sóng radio đó theo đơn vị Megahertz (MHz). (1 MHz = 10⁶ Hz).  </w:t>
+        <w:t xml:space="preserve"> Cho các phát biểu sau đây về vai trò và đối tượng nghiên cứu của Vật lí học:</w:t>
+      </w:r>
+    </w:p>
+    <w:p>
+      <w:pPr>
+        <w:spacing w:before="0" w:after="120" w:line="300" w:lineRule="auto"/>
+      </w:pPr>
+      <w:r>
+        <w:rPr>
+          <w:rFonts w:ascii="Times New Roman" w:hAnsi="Times New Roman"/>
+        </w:rPr>
+        <w:t>(1) Vật lí học nghiên cứu các dạng vận động của vật chất và năng lượng.</w:t>
+      </w:r>
+    </w:p>
+    <w:p>
+      <w:pPr>
+        <w:spacing w:before="0" w:after="120" w:line="300" w:lineRule="auto"/>
+      </w:pPr>
+      <w:r>
+        <w:rPr>
+          <w:rFonts w:ascii="Times New Roman" w:hAnsi="Times New Roman"/>
+        </w:rPr>
+        <w:t>(2) Công nghệ vi mạch bán dẫn là nền tảng khởi đầu cho cuộc cách mạng công nghiệp lần thứ nhất.</w:t>
+      </w:r>
+    </w:p>
+    <w:p>
+      <w:pPr>
+        <w:spacing w:before="0" w:after="120" w:line="300" w:lineRule="auto"/>
+      </w:pPr>
+      <w:r>
+        <w:rPr>
+          <w:rFonts w:ascii="Times New Roman" w:hAnsi="Times New Roman"/>
+        </w:rPr>
+        <w:t>(3) Thí nghiệm kiểm tra là bước quyết định để đánh giá tính đúng đắn của giả thuyết trong phương pháp thực nghiệm.</w:t>
+      </w:r>
+    </w:p>
+    <w:p>
+      <w:pPr>
+        <w:spacing w:before="0" w:after="120" w:line="300" w:lineRule="auto"/>
+      </w:pPr>
+      <w:r>
+        <w:rPr>
+          <w:rFonts w:ascii="Times New Roman" w:hAnsi="Times New Roman"/>
+        </w:rPr>
+        <w:t>(4) Ngành Vật lí y khoa ứng dụng các công nghệ như chụp X-quang, chụp cộng hưởng từ MRI để chẩn đoán bệnh.</w:t>
+      </w:r>
+    </w:p>
+    <w:p>
+      <w:pPr>
+        <w:spacing w:before="0" w:after="120" w:line="300" w:lineRule="auto"/>
+      </w:pPr>
+      <w:r>
+        <w:rPr>
+          <w:rFonts w:ascii="Times New Roman" w:hAnsi="Times New Roman"/>
+        </w:rPr>
+        <w:t xml:space="preserve">Hỏi có bao nhiêu phát biểu </w:t>
+      </w:r>
+      <w:r>
+        <w:rPr>
+          <w:rFonts w:ascii="Times New Roman" w:hAnsi="Times New Roman"/>
+          <w:b/>
+        </w:rPr>
+        <w:t>đúng</w:t>
+      </w:r>
+      <w:r>
+        <w:rPr>
+          <w:rFonts w:ascii="Times New Roman" w:hAnsi="Times New Roman"/>
+        </w:rPr>
+        <w:t xml:space="preserve"> trong các phát biểu trên?  </w:t>
       </w:r>
     </w:p>
     <w:p>
@@ -3101,7 +3169,7 @@
                 <w:rFonts w:ascii="Times New Roman" w:hAnsi="Times New Roman"/>
                 <w:b/>
               </w:rPr>
-              <w:t>100</w:t>
+              <w:t>5</w:t>
             </w:r>
           </w:p>
         </w:tc>
@@ -3129,7 +3197,7 @@
               <w:rPr>
                 <w:rFonts w:ascii="Times New Roman" w:hAnsi="Times New Roman"/>
               </w:rPr>
-              <w:t>Điện năng thu được: E = 500 × 20% = 100 J.</w:t>
+              <w:t>Quy trình thực nghiệm gồm 5 bước: Quan sát → Giả thuyết → Dự đoán → Thí nghiệm → Kết luận.</w:t>
             </w:r>
           </w:p>
         </w:tc>
@@ -3194,7 +3262,7 @@
                 <w:rFonts w:ascii="Times New Roman" w:hAnsi="Times New Roman"/>
                 <w:b/>
               </w:rPr>
-              <w:t>4</w:t>
+              <w:t>1</w:t>
             </w:r>
           </w:p>
         </w:tc>
@@ -3223,7 +3291,7 @@
               <w:rPr>
                 <w:rFonts w:ascii="Times New Roman" w:hAnsi="Times New Roman"/>
               </w:rPr>
-              <w:t>Thời gian ánh sáng truyền từ ngôi sao cách 4 năm ánh sáng đến Trái Đất đúng bằng 4 năm.</w:t>
+              <w:t>Máy hơi nước của James Watt khởi đầu cho Cuộc cách mạng công nghiệp lần thứ nhất (1.0).</w:t>
             </w:r>
           </w:p>
         </w:tc>
@@ -3286,7 +3354,7 @@
                 <w:rFonts w:ascii="Times New Roman" w:hAnsi="Times New Roman"/>
                 <w:b/>
               </w:rPr>
-              <w:t>0,2</w:t>
+              <w:t>2</w:t>
             </w:r>
           </w:p>
         </w:tc>
@@ -3314,7 +3382,7 @@
               <w:rPr>
                 <w:rFonts w:ascii="Times New Roman" w:hAnsi="Times New Roman"/>
               </w:rPr>
-              <w:t>Liều hấp thụ năng lượng trung bình: D = E/m = 0,4/2 = 0,2 J/kg.</w:t>
+              <w:t>Hai phương pháp nghiên cứu cơ bản trong Vật lí là phương pháp thực nghiệm và phương pháp lý thuyết.</w:t>
             </w:r>
           </w:p>
         </w:tc>
@@ -3408,7 +3476,7 @@
               <w:rPr>
                 <w:rFonts w:ascii="Times New Roman" w:hAnsi="Times New Roman"/>
               </w:rPr>
-              <w:t>Tần số f = c/λ = 3 · 10⁸/100 = 3 · 10⁶ Hz = 3 MHz.</w:t>
+              <w:t>Có 3 phát biểu đúng là (1), (3), (4). Phát biểu (2) sai vì công nghệ vi mạch bán dẫn thuộc Cuộc cách mạng công nghiệp lần thứ ba (3.0).</w:t>
             </w:r>
           </w:p>
         </w:tc>

</xml_diff>

<commit_message>
Điều chỉnh câu 2 và câu 3 phần trả lời ngắn bài 1 Vật lí 10
</commit_message>
<xml_diff>
--- a/Lop10/Bai1/Phieu_BaiTap.docx
+++ b/Lop10/Bai1/Phieu_BaiTap.docx
@@ -1256,7 +1256,7 @@
         <w:rPr>
           <w:rFonts w:ascii="Times New Roman" w:hAnsi="Times New Roman"/>
         </w:rPr>
-        <w:t xml:space="preserve"> Phát minh ra máy hơi nước của James Watt (khi nghiên cứu về Nhiệt học) là động lực khởi đầu cho cuộc cách mạng công nghiệp lần thứ mấy của nhân loại?  </w:t>
+        <w:t xml:space="preserve"> Sự ra đời của công nghệ vi mạch bán dẫn, máy tính và tự động hóa là nền tảng khởi đầu cho cuộc cách mạng công nghiệp lần thứ mấy của nhân loại?  </w:t>
       </w:r>
     </w:p>
     <w:p>
@@ -1292,7 +1292,7 @@
         <w:rPr>
           <w:rFonts w:ascii="Times New Roman" w:hAnsi="Times New Roman"/>
         </w:rPr>
-        <w:t xml:space="preserve"> Có bao nhiêu phương pháp nghiên cứu cơ bản được sử dụng chủ yếu trong Vật lí học (gồm phương pháp thực nghiệm và phương pháp lý thuyết)?  </w:t>
+        <w:t xml:space="preserve"> Có bao nhiêu phương pháp nghiên cứu cơ bản được sử dụng chủ yếu trong Vật lí học?  </w:t>
       </w:r>
     </w:p>
     <w:p>
@@ -3262,7 +3262,7 @@
                 <w:rFonts w:ascii="Times New Roman" w:hAnsi="Times New Roman"/>
                 <w:b/>
               </w:rPr>
-              <w:t>1</w:t>
+              <w:t>3</w:t>
             </w:r>
           </w:p>
         </w:tc>
@@ -3291,7 +3291,7 @@
               <w:rPr>
                 <w:rFonts w:ascii="Times New Roman" w:hAnsi="Times New Roman"/>
               </w:rPr>
-              <w:t>Máy hơi nước của James Watt khởi đầu cho Cuộc cách mạng công nghiệp lần thứ nhất (1.0).</w:t>
+              <w:t>Công nghệ vi mạch bán dẫn và máy tính khởi đầu cho Cuộc cách mạng công nghiệp lần thứ ba (3.0).</w:t>
             </w:r>
           </w:p>
         </w:tc>

</xml_diff>